<commit_message>
Application case study results, rewritten manuscript, review round 10, updated audits
Co-Authored-By: Claude Opus 5.5 <noreply@anthropic.com>
Claude-Session: https://claude.ai/code/session_01N37jqkuXFqBzMgdEb5bNnp
</commit_message>
<xml_diff>
--- a/Target_Journal_Submission/manuscript/Cover_Letter.docx
+++ b/Target_Journal_Submission/manuscript/Cover_Letter.docx
@@ -10,19 +10,19 @@
         <w:t xml:space="preserve">[Corresponding author name]</w:t>
       </w:r>
       <w:r>
-        <w:t xml:space="preserve"> </w:t>
+        <w:br/>
       </w:r>
       <w:r>
         <w:t xml:space="preserve">[Department, Institution]</w:t>
       </w:r>
       <w:r>
-        <w:t xml:space="preserve"> </w:t>
+        <w:br/>
       </w:r>
       <w:r>
         <w:t xml:space="preserve">[Address, City, Country]</w:t>
       </w:r>
       <w:r>
-        <w:t xml:space="preserve"> </w:t>
+        <w:br/>
       </w:r>
       <w:r>
         <w:t xml:space="preserve">[E-mail] · ORCID [0000-0000-0000-0000]</w:t>
@@ -44,7 +44,7 @@
         <w:t xml:space="preserve">The Editor-in-Chief</w:t>
       </w:r>
       <w:r>
-        <w:t xml:space="preserve"> </w:t>
+        <w:br/>
       </w:r>
       <w:r>
         <w:rPr>
@@ -54,7 +54,7 @@
         <w:t xml:space="preserve">Journal of King Saud University – Computer and Information Sciences</w:t>
       </w:r>
       <w:r>
-        <w:t xml:space="preserve"> </w:t>
+        <w:br/>
       </w:r>
       <w:r>
         <w:t xml:space="preserve">Springer Nature</w:t>
@@ -102,7 +102,7 @@
           <w:bCs/>
           <w:b/>
         </w:rPr>
-        <w:t xml:space="preserve">Shift-aware probabilities for random convolutional kernel time series classifiers via leverage-moderated leave-one-out calibration</w:t>
+        <w:t xml:space="preserve">Knowing when to ask a human: reliable confidence for fast time series classifiers under sensor faults</w:t>
       </w:r>
       <w:r>
         <w:rPr>
@@ -146,7 +146,7 @@
         <w:t xml:space="preserve"> </w:t>
       </w:r>
       <w:r>
-        <w:t xml:space="preserve">Random convolutional kernel classifiers such as MiniRocket are among the most accurate and efficient time series classifiers, but their ridge readout returns scores rather than probabilities. Existing remedies apply a single global calibration that does not lower confidence when test series drift away from the training data. We propose LOOM, a closed-form readout that standardises the ridge logits by their leverage and fits a temperature and the ridge penalty on exact leave-one-out score–leverage pairs. It needs no held-out data, refitting or ensembles. The same identities give exact jackknife+ prediction sets without refitting. On 114 UCR datasets with five resamples and a pre-registered benchmark of 18 test-time corruptions, LOOM matches the strongest closed-form baseline on clean data in negative log-likelihood, lowers the median negative log-likelihood under corruption from 1.73 to 0.74 (better on 108 of 114 datasets; Holm-adjusted Wilcoxon p &lt; 0.001), and detects corrupted inputs considerably better, at essentially the cost of the ridge fit.</w:t>
+        <w:t xml:space="preserve">Many monitoring systems, from wearable heart monitors to industrial sensors, let a classifier decide on its own and pass uncertain cases to a person. This only works if the classifier’s confidence drops when a recording is damaged, for example by electrode noise, drift, spikes or dropouts. Fast random convolutional kernel classifiers such as MiniRocket are accurate and cheap enough for such systems, but their confidence does not drop on faulty recordings. We propose LOOM, a closed-form readout that scales each prediction by how far the recording lies from the training data, measured by the ridge leverage, and that is calibrated on exact leave-one-out quantities without held-out data, refitting or ensembles. On 114 UCR datasets with a pre-registered benchmark of 18 simulated sensor faults, and in a human-in-the-loop study on cardiac, wearable and industrial sensor data, LOOM matches the best existing readout on clean data, lowers the median negative log-likelihood under simulated sensor faults from 1.73 to 0.74 (better on 108 of 114 datasets), and in a human-in-the-loop study on cardiac, wearable and industrial sensor data sends 45 % of the faulty recordings to the reviewer with a 20 % review budget, against 25 % for PreVal, at essentially the cost of the ridge fit.</w:t>
       </w:r>
     </w:p>
     <w:p>
@@ -164,7 +164,7 @@
         <w:t xml:space="preserve"> </w:t>
       </w:r>
       <w:r>
-        <w:t xml:space="preserve">The work addresses machine learning, pattern recognition and data mining for time series, which are explicitly within the journal’s aims and scope. It contributes a reusable, computationally light method and an evaluation protocol of interest to readers working on trustworthy AI in sensor, medical and industrial monitoring applications.</w:t>
+        <w:t xml:space="preserve">The work addresses machine learning, pattern recognition and data mining for time series, which are explicitly within the journal’s aims and scope. It offers a practical, computationally light solution for monitoring applications in health care and industry, where data are scarce and decisions are shared between a model and a human reviewer.</w:t>
       </w:r>
     </w:p>
     <w:p>

</xml_diff>